<commit_message>
Docs: explain the ctl schema and mark it as design only
</commit_message>
<xml_diff>
--- a/docs/DANH-GIA-VA-DE-XUAT-NANG-CAP.docx
+++ b/docs/DANH-GIA-VA-DE-XUAT-NANG-CAP.docx
@@ -3939,7 +3939,67 @@
         <w:rPr>
           <w:rFonts w:ascii="Arial" w:cs="Arial" w:eastAsia="Arial" w:hAnsi="Arial"/>
         </w:rPr>
-        <w:t xml:space="preserve">: chứa raw, staging, dwh, mart, </w:t>
+        <w:t xml:space="preserve">: bản local </w:t>
+      </w:r>
+      <w:r>
+        <w:rPr>
+          <w:rFonts w:ascii="Arial" w:cs="Arial" w:eastAsia="Arial" w:hAnsi="Arial"/>
+          <w:color w:val="1F5FA8"/>
+          <w:sz w:val="21"/>
+          <w:szCs w:val="21"/>
+        </w:rPr>
+        <w:t xml:space="preserve">[L]</w:t>
+      </w:r>
+      <w:r>
+        <w:rPr>
+          <w:rFonts w:ascii="Arial" w:cs="Arial" w:eastAsia="Arial" w:hAnsi="Arial"/>
+        </w:rPr>
+        <w:t xml:space="preserve"> đã chạy với các schema </w:t>
+      </w:r>
+      <w:r>
+        <w:rPr>
+          <w:rFonts w:ascii="Consolas" w:cs="Consolas" w:eastAsia="Consolas" w:hAnsi="Consolas"/>
+          <w:color w:val="333333"/>
+          <w:sz w:val="21"/>
+          <w:szCs w:val="21"/>
+        </w:rPr>
+        <w:t xml:space="preserve">raw_intranet</w:t>
+      </w:r>
+      <w:r>
+        <w:rPr>
+          <w:rFonts w:ascii="Arial" w:cs="Arial" w:eastAsia="Arial" w:hAnsi="Arial"/>
+        </w:rPr>
+        <w:t xml:space="preserve">, </w:t>
+      </w:r>
+      <w:r>
+        <w:rPr>
+          <w:rFonts w:ascii="Consolas" w:cs="Consolas" w:eastAsia="Consolas" w:hAnsi="Consolas"/>
+          <w:color w:val="333333"/>
+          <w:sz w:val="21"/>
+          <w:szCs w:val="21"/>
+        </w:rPr>
+        <w:t xml:space="preserve">staging</w:t>
+      </w:r>
+      <w:r>
+        <w:rPr>
+          <w:rFonts w:ascii="Arial" w:cs="Arial" w:eastAsia="Arial" w:hAnsi="Arial"/>
+        </w:rPr>
+        <w:t xml:space="preserve">, </w:t>
+      </w:r>
+      <w:r>
+        <w:rPr>
+          <w:rFonts w:ascii="Consolas" w:cs="Consolas" w:eastAsia="Consolas" w:hAnsi="Consolas"/>
+          <w:color w:val="333333"/>
+          <w:sz w:val="21"/>
+          <w:szCs w:val="21"/>
+        </w:rPr>
+        <w:t xml:space="preserve">dwh</w:t>
+      </w:r>
+      <w:r>
+        <w:rPr>
+          <w:rFonts w:ascii="Arial" w:cs="Arial" w:eastAsia="Arial" w:hAnsi="Arial"/>
+        </w:rPr>
+        <w:t xml:space="preserve">, </w:t>
       </w:r>
       <w:r>
         <w:rPr>
@@ -3954,6 +4014,21 @@
         <w:rPr>
           <w:rFonts w:ascii="Arial" w:cs="Arial" w:eastAsia="Arial" w:hAnsi="Arial"/>
         </w:rPr>
+        <w:t xml:space="preserve">. Các schema </w:t>
+      </w:r>
+      <w:r>
+        <w:rPr>
+          <w:rFonts w:ascii="Consolas" w:cs="Consolas" w:eastAsia="Consolas" w:hAnsi="Consolas"/>
+          <w:color w:val="333333"/>
+          <w:sz w:val="21"/>
+          <w:szCs w:val="21"/>
+        </w:rPr>
+        <w:t xml:space="preserve">mart</w:t>
+      </w:r>
+      <w:r>
+        <w:rPr>
+          <w:rFonts w:ascii="Arial" w:cs="Arial" w:eastAsia="Arial" w:hAnsi="Arial"/>
+        </w:rPr>
         <w:t xml:space="preserve">, </w:t>
       </w:r>
       <w:r>
@@ -3963,12 +4038,111 @@
           <w:sz w:val="21"/>
           <w:szCs w:val="21"/>
         </w:rPr>
+        <w:t xml:space="preserve">mart_restricted</w:t>
+      </w:r>
+      <w:r>
+        <w:rPr>
+          <w:rFonts w:ascii="Arial" w:cs="Arial" w:eastAsia="Arial" w:hAnsi="Arial"/>
+        </w:rPr>
+        <w:t xml:space="preserve">, bảng đệm </w:t>
+      </w:r>
+      <w:r>
+        <w:rPr>
+          <w:rFonts w:ascii="Consolas" w:cs="Consolas" w:eastAsia="Consolas" w:hAnsi="Consolas"/>
+          <w:color w:val="333333"/>
+          <w:sz w:val="21"/>
+          <w:szCs w:val="21"/>
+        </w:rPr>
+        <w:t xml:space="preserve">raw_stage</w:t>
+      </w:r>
+      <w:r>
+        <w:rPr>
+          <w:rFonts w:ascii="Arial" w:cs="Arial" w:eastAsia="Arial" w:hAnsi="Arial"/>
+        </w:rPr>
+        <w:t xml:space="preserve"> và schema </w:t>
+      </w:r>
+      <w:r>
+        <w:rPr>
+          <w:rFonts w:ascii="Consolas" w:cs="Consolas" w:eastAsia="Consolas" w:hAnsi="Consolas"/>
+          <w:color w:val="333333"/>
+          <w:sz w:val="21"/>
+          <w:szCs w:val="21"/>
+        </w:rPr>
         <w:t xml:space="preserve">ctl</w:t>
       </w:r>
       <w:r>
         <w:rPr>
           <w:rFonts w:ascii="Arial" w:cs="Arial" w:eastAsia="Arial" w:hAnsi="Arial"/>
         </w:rPr>
+        <w:t xml:space="preserve"> (control: chứa hàm </w:t>
+      </w:r>
+      <w:r>
+        <w:rPr>
+          <w:rFonts w:ascii="Consolas" w:cs="Consolas" w:eastAsia="Consolas" w:hAnsi="Consolas"/>
+          <w:color w:val="333333"/>
+          <w:sz w:val="21"/>
+          <w:szCs w:val="21"/>
+        </w:rPr>
+        <w:t xml:space="preserve">ctl.promote</w:t>
+      </w:r>
+      <w:r>
+        <w:rPr>
+          <w:rFonts w:ascii="Arial" w:cs="Arial" w:eastAsia="Arial" w:hAnsi="Arial"/>
+        </w:rPr>
+        <w:t xml:space="preserve"> và các bảng ghi lịch sử chạy, xem mục 2.3) mới là thiết kế, chưa có trong bản local.</w:t>
+      </w:r>
+    </w:p>
+    <w:p>
+      <w:pPr>
+        <w:pStyle w:val="ListParagraph"/>
+        <w:numPr>
+          <w:ilvl w:val="0"/>
+          <w:numId w:val="2"/>
+        </w:numPr>
+        <w:spacing w:after="80" w:line="288"/>
+      </w:pPr>
+      <w:r>
+        <w:rPr>
+          <w:rFonts w:ascii="Arial" w:cs="Arial" w:eastAsia="Arial" w:hAnsi="Arial"/>
+          <w:b/>
+          <w:bCs/>
+        </w:rPr>
+        <w:t xml:space="preserve">dbt</w:t>
+      </w:r>
+      <w:r>
+        <w:rPr>
+          <w:rFonts w:ascii="Arial" w:cs="Arial" w:eastAsia="Arial" w:hAnsi="Arial"/>
+        </w:rPr>
+        <w:t xml:space="preserve">: </w:t>
+      </w:r>
+      <w:r>
+        <w:rPr>
+          <w:rFonts w:ascii="Consolas" w:cs="Consolas" w:eastAsia="Consolas" w:hAnsi="Consolas"/>
+          <w:color w:val="333333"/>
+          <w:sz w:val="21"/>
+          <w:szCs w:val="21"/>
+        </w:rPr>
+        <w:t xml:space="preserve">dbt build</w:t>
+      </w:r>
+      <w:r>
+        <w:rPr>
+          <w:rFonts w:ascii="Arial" w:cs="Arial" w:eastAsia="Arial" w:hAnsi="Arial"/>
+        </w:rPr>
+        <w:t xml:space="preserve"> chạy model và test theo thứ tự DAG </w:t>
+      </w:r>
+      <w:r>
+        <w:rPr>
+          <w:rFonts w:ascii="Arial" w:cs="Arial" w:eastAsia="Arial" w:hAnsi="Arial"/>
+          <w:color w:val="1F5FA8"/>
+          <w:sz w:val="21"/>
+          <w:szCs w:val="21"/>
+        </w:rPr>
+        <w:t xml:space="preserve">[W11]</w:t>
+      </w:r>
+      <w:r>
+        <w:rPr>
+          <w:rFonts w:ascii="Arial" w:cs="Arial" w:eastAsia="Arial" w:hAnsi="Arial"/>
+        </w:rPr>
         <w:t xml:space="preserve">. Đã chạy thử local </w:t>
       </w:r>
       <w:r>
@@ -4002,7 +4176,7 @@
           <w:b/>
           <w:bCs/>
         </w:rPr>
-        <w:t xml:space="preserve">dbt</w:t>
+        <w:t xml:space="preserve">Elementary</w:t>
       </w:r>
       <w:r>
         <w:rPr>
@@ -4017,13 +4191,13 @@
           <w:sz w:val="21"/>
           <w:szCs w:val="21"/>
         </w:rPr>
-        <w:t xml:space="preserve">dbt build</w:t>
-      </w:r>
-      <w:r>
-        <w:rPr>
-          <w:rFonts w:ascii="Arial" w:cs="Arial" w:eastAsia="Arial" w:hAnsi="Arial"/>
-        </w:rPr>
-        <w:t xml:space="preserve"> chạy model và test theo thứ tự DAG </w:t>
+        <w:t xml:space="preserve">schema_changes</w:t>
+      </w:r>
+      <w:r>
+        <w:rPr>
+          <w:rFonts w:ascii="Arial" w:cs="Arial" w:eastAsia="Arial" w:hAnsi="Arial"/>
+        </w:rPr>
+        <w:t xml:space="preserve"> phát hiện cột thêm, xóa, đổi kiểu </w:t>
       </w:r>
       <w:r>
         <w:rPr>
@@ -4032,7 +4206,22 @@
           <w:sz w:val="21"/>
           <w:szCs w:val="21"/>
         </w:rPr>
-        <w:t xml:space="preserve">[W11]</w:t>
+        <w:t xml:space="preserve">[W13]</w:t>
+      </w:r>
+      <w:r>
+        <w:rPr>
+          <w:rFonts w:ascii="Arial" w:cs="Arial" w:eastAsia="Arial" w:hAnsi="Arial"/>
+        </w:rPr>
+        <w:t xml:space="preserve">; sinh báo cáo HTML </w:t>
+      </w:r>
+      <w:r>
+        <w:rPr>
+          <w:rFonts w:ascii="Arial" w:cs="Arial" w:eastAsia="Arial" w:hAnsi="Arial"/>
+          <w:color w:val="1F5FA8"/>
+          <w:sz w:val="21"/>
+          <w:szCs w:val="21"/>
+        </w:rPr>
+        <w:t xml:space="preserve">[W14]</w:t>
       </w:r>
       <w:r>
         <w:rPr>
@@ -4071,28 +4260,28 @@
           <w:b/>
           <w:bCs/>
         </w:rPr>
-        <w:t xml:space="preserve">Elementary</w:t>
-      </w:r>
-      <w:r>
-        <w:rPr>
-          <w:rFonts w:ascii="Arial" w:cs="Arial" w:eastAsia="Arial" w:hAnsi="Arial"/>
-        </w:rPr>
-        <w:t xml:space="preserve">: </w:t>
-      </w:r>
-      <w:r>
-        <w:rPr>
-          <w:rFonts w:ascii="Consolas" w:cs="Consolas" w:eastAsia="Consolas" w:hAnsi="Consolas"/>
-          <w:color w:val="333333"/>
-          <w:sz w:val="21"/>
-          <w:szCs w:val="21"/>
-        </w:rPr>
-        <w:t xml:space="preserve">schema_changes</w:t>
-      </w:r>
-      <w:r>
-        <w:rPr>
-          <w:rFonts w:ascii="Arial" w:cs="Arial" w:eastAsia="Arial" w:hAnsi="Arial"/>
-        </w:rPr>
-        <w:t xml:space="preserve"> phát hiện cột thêm, xóa, đổi kiểu </w:t>
+        <w:t xml:space="preserve">Azure Data Factory</w:t>
+      </w:r>
+      <w:r>
+        <w:rPr>
+          <w:rFonts w:ascii="Arial" w:cs="Arial" w:eastAsia="Arial" w:hAnsi="Arial"/>
+        </w:rPr>
+        <w:t xml:space="preserve"> (</w:t>
+      </w:r>
+      <w:r>
+        <w:rPr>
+          <w:rFonts w:ascii="Consolas" w:cs="Consolas" w:eastAsia="Consolas" w:hAnsi="Consolas"/>
+          <w:color w:val="333333"/>
+          <w:sz w:val="21"/>
+          <w:szCs w:val="21"/>
+        </w:rPr>
+        <w:t xml:space="preserve">pl_ingest</w:t>
+      </w:r>
+      <w:r>
+        <w:rPr>
+          <w:rFonts w:ascii="Arial" w:cs="Arial" w:eastAsia="Arial" w:hAnsi="Arial"/>
+        </w:rPr>
+        <w:t xml:space="preserve">): Copy activity chép dữ liệu giữa on-premises và cloud, cần self-hosted integration runtime khi nguồn ở mạng có kiểm soát truy cập </w:t>
       </w:r>
       <w:r>
         <w:rPr>
@@ -4101,13 +4290,52 @@
           <w:sz w:val="21"/>
           <w:szCs w:val="21"/>
         </w:rPr>
-        <w:t xml:space="preserve">[W13]</w:t>
-      </w:r>
-      <w:r>
-        <w:rPr>
-          <w:rFonts w:ascii="Arial" w:cs="Arial" w:eastAsia="Arial" w:hAnsi="Arial"/>
-        </w:rPr>
-        <w:t xml:space="preserve">; sinh báo cáo HTML </w:t>
+        <w:t xml:space="preserve">[W17]</w:t>
+      </w:r>
+      <w:r>
+        <w:rPr>
+          <w:rFonts w:ascii="Arial" w:cs="Arial" w:eastAsia="Arial" w:hAnsi="Arial"/>
+        </w:rPr>
+        <w:t xml:space="preserve">. Thiết kế, chưa chạy.</w:t>
+      </w:r>
+    </w:p>
+    <w:p>
+      <w:pPr>
+        <w:pStyle w:val="ListParagraph"/>
+        <w:numPr>
+          <w:ilvl w:val="0"/>
+          <w:numId w:val="2"/>
+        </w:numPr>
+        <w:spacing w:after="80" w:line="288"/>
+      </w:pPr>
+      <w:r>
+        <w:rPr>
+          <w:rFonts w:ascii="Arial" w:cs="Arial" w:eastAsia="Arial" w:hAnsi="Arial"/>
+          <w:b/>
+          <w:bCs/>
+        </w:rPr>
+        <w:t xml:space="preserve">Điều phối</w:t>
+      </w:r>
+      <w:r>
+        <w:rPr>
+          <w:rFonts w:ascii="Arial" w:cs="Arial" w:eastAsia="Arial" w:hAnsi="Arial"/>
+        </w:rPr>
+        <w:t xml:space="preserve"> (</w:t>
+      </w:r>
+      <w:r>
+        <w:rPr>
+          <w:rFonts w:ascii="Consolas" w:cs="Consolas" w:eastAsia="Consolas" w:hAnsi="Consolas"/>
+          <w:color w:val="333333"/>
+          <w:sz w:val="21"/>
+          <w:szCs w:val="21"/>
+        </w:rPr>
+        <w:t xml:space="preserve">pl_orchestrator</w:t>
+      </w:r>
+      <w:r>
+        <w:rPr>
+          <w:rFonts w:ascii="Arial" w:cs="Arial" w:eastAsia="Arial" w:hAnsi="Arial"/>
+        </w:rPr>
+        <w:t xml:space="preserve">, Container Apps Job): ADF giới hạn số run đồng thời, run vượt giới hạn xếp hàng </w:t>
       </w:r>
       <w:r>
         <w:rPr>
@@ -4116,13 +4344,13 @@
           <w:sz w:val="21"/>
           <w:szCs w:val="21"/>
         </w:rPr>
-        <w:t xml:space="preserve">[W14]</w:t>
-      </w:r>
-      <w:r>
-        <w:rPr>
-          <w:rFonts w:ascii="Arial" w:cs="Arial" w:eastAsia="Arial" w:hAnsi="Arial"/>
-        </w:rPr>
-        <w:t xml:space="preserve">. Đã chạy thử local </w:t>
+        <w:t xml:space="preserve">[W18]</w:t>
+      </w:r>
+      <w:r>
+        <w:rPr>
+          <w:rFonts w:ascii="Arial" w:cs="Arial" w:eastAsia="Arial" w:hAnsi="Arial"/>
+        </w:rPr>
+        <w:t xml:space="preserve">; Container Apps Job nhận ghi đè cấu hình khi start </w:t>
       </w:r>
       <w:r>
         <w:rPr>
@@ -4131,6 +4359,99 @@
           <w:sz w:val="21"/>
           <w:szCs w:val="21"/>
         </w:rPr>
+        <w:t xml:space="preserve">[W16]</w:t>
+      </w:r>
+      <w:r>
+        <w:rPr>
+          <w:rFonts w:ascii="Arial" w:cs="Arial" w:eastAsia="Arial" w:hAnsi="Arial"/>
+        </w:rPr>
+        <w:t xml:space="preserve">. Thiết kế, chưa chạy.</w:t>
+      </w:r>
+    </w:p>
+    <w:p>
+      <w:pPr>
+        <w:pStyle w:val="ListParagraph"/>
+        <w:numPr>
+          <w:ilvl w:val="0"/>
+          <w:numId w:val="2"/>
+        </w:numPr>
+        <w:spacing w:after="80" w:line="288"/>
+      </w:pPr>
+      <w:r>
+        <w:rPr>
+          <w:rFonts w:ascii="Arial" w:cs="Arial" w:eastAsia="Arial" w:hAnsi="Arial"/>
+          <w:b/>
+          <w:bCs/>
+        </w:rPr>
+        <w:t xml:space="preserve">Key Vault và Terraform</w:t>
+      </w:r>
+      <w:r>
+        <w:rPr>
+          <w:rFonts w:ascii="Arial" w:cs="Arial" w:eastAsia="Arial" w:hAnsi="Arial"/>
+        </w:rPr>
+        <w:t xml:space="preserve">: Container Apps tham chiếu secret trong Key Vault </w:t>
+      </w:r>
+      <w:r>
+        <w:rPr>
+          <w:rFonts w:ascii="Arial" w:cs="Arial" w:eastAsia="Arial" w:hAnsi="Arial"/>
+          <w:color w:val="1F5FA8"/>
+          <w:sz w:val="21"/>
+          <w:szCs w:val="21"/>
+        </w:rPr>
+        <w:t xml:space="preserve">[W23]</w:t>
+      </w:r>
+      <w:r>
+        <w:rPr>
+          <w:rFonts w:ascii="Arial" w:cs="Arial" w:eastAsia="Arial" w:hAnsi="Arial"/>
+        </w:rPr>
+        <w:t xml:space="preserve">; Terraform dựng hạ tầng. Thiết kế, chưa triển khai.</w:t>
+      </w:r>
+    </w:p>
+    <w:p>
+      <w:pPr>
+        <w:pStyle w:val="ListParagraph"/>
+        <w:numPr>
+          <w:ilvl w:val="0"/>
+          <w:numId w:val="2"/>
+        </w:numPr>
+        <w:spacing w:after="80" w:line="288"/>
+      </w:pPr>
+      <w:r>
+        <w:rPr>
+          <w:rFonts w:ascii="Arial" w:cs="Arial" w:eastAsia="Arial" w:hAnsi="Arial"/>
+          <w:b/>
+          <w:bCs/>
+        </w:rPr>
+        <w:t xml:space="preserve">Docker Compose</w:t>
+      </w:r>
+      <w:r>
+        <w:rPr>
+          <w:rFonts w:ascii="Arial" w:cs="Arial" w:eastAsia="Arial" w:hAnsi="Arial"/>
+        </w:rPr>
+        <w:t xml:space="preserve"> (</w:t>
+      </w:r>
+      <w:r>
+        <w:rPr>
+          <w:rFonts w:ascii="Consolas" w:cs="Consolas" w:eastAsia="Consolas" w:hAnsi="Consolas"/>
+          <w:color w:val="333333"/>
+          <w:sz w:val="21"/>
+          <w:szCs w:val="21"/>
+        </w:rPr>
+        <w:t xml:space="preserve">scripts/run_local.sh</w:t>
+      </w:r>
+      <w:r>
+        <w:rPr>
+          <w:rFonts w:ascii="Arial" w:cs="Arial" w:eastAsia="Arial" w:hAnsi="Arial"/>
+        </w:rPr>
+        <w:t xml:space="preserve">): dựng kho rỗng, nạp dữ liệu mẫu, chạy dbt và Elementary bằng một lệnh. Đã có local </w:t>
+      </w:r>
+      <w:r>
+        <w:rPr>
+          <w:rFonts w:ascii="Arial" w:cs="Arial" w:eastAsia="Arial" w:hAnsi="Arial"/>
+          <w:color w:val="1F5FA8"/>
+          <w:sz w:val="21"/>
+          <w:szCs w:val="21"/>
+        </w:rPr>
         <w:t xml:space="preserve">[L]</w:t>
       </w:r>
       <w:r>
@@ -4142,41 +4463,83 @@
     </w:p>
     <w:p>
       <w:pPr>
-        <w:pStyle w:val="ListParagraph"/>
-        <w:numPr>
-          <w:ilvl w:val="0"/>
-          <w:numId w:val="2"/>
-        </w:numPr>
-        <w:spacing w:after="80" w:line="288"/>
-      </w:pPr>
-      <w:r>
-        <w:rPr>
-          <w:rFonts w:ascii="Arial" w:cs="Arial" w:eastAsia="Arial" w:hAnsi="Arial"/>
-          <w:b/>
-          <w:bCs/>
-        </w:rPr>
-        <w:t xml:space="preserve">Azure Data Factory</w:t>
-      </w:r>
-      <w:r>
-        <w:rPr>
-          <w:rFonts w:ascii="Arial" w:cs="Arial" w:eastAsia="Arial" w:hAnsi="Arial"/>
-        </w:rPr>
-        <w:t xml:space="preserve"> (</w:t>
-      </w:r>
-      <w:r>
-        <w:rPr>
-          <w:rFonts w:ascii="Consolas" w:cs="Consolas" w:eastAsia="Consolas" w:hAnsi="Consolas"/>
-          <w:color w:val="333333"/>
-          <w:sz w:val="21"/>
-          <w:szCs w:val="21"/>
-        </w:rPr>
-        <w:t xml:space="preserve">pl_ingest</w:t>
-      </w:r>
-      <w:r>
-        <w:rPr>
-          <w:rFonts w:ascii="Arial" w:cs="Arial" w:eastAsia="Arial" w:hAnsi="Arial"/>
-        </w:rPr>
-        <w:t xml:space="preserve">): Copy activity chép dữ liệu giữa on-premises và cloud, cần self-hosted integration runtime khi nguồn ở mạng có kiểm soát truy cập </w:t>
+        <w:pStyle w:val="Heading2"/>
+      </w:pPr>
+      <w:r>
+        <w:rPr>
+          <w:rFonts w:ascii="Arial" w:cs="Arial" w:eastAsia="Arial" w:hAnsi="Arial"/>
+        </w:rPr>
+        <w:t xml:space="preserve">2.3. Luồng nạp: bảng đệm rồi thay bảng trong một transaction</w:t>
+      </w:r>
+    </w:p>
+    <w:p>
+      <w:pPr>
+        <w:spacing w:after="140" w:line="300"/>
+      </w:pPr>
+      <w:r>
+        <w:rPr>
+          <w:rFonts w:ascii="Arial" w:cs="Arial" w:eastAsia="Arial" w:hAnsi="Arial"/>
+        </w:rPr>
+        <w:t xml:space="preserve">Mỗi bảng nạp qua hai bước: (1) sao chép nguyên bản vào bảng đệm </w:t>
+      </w:r>
+      <w:r>
+        <w:rPr>
+          <w:rFonts w:ascii="Consolas" w:cs="Consolas" w:eastAsia="Consolas" w:hAnsi="Consolas"/>
+          <w:color w:val="333333"/>
+          <w:sz w:val="21"/>
+          <w:szCs w:val="21"/>
+        </w:rPr>
+        <w:t xml:space="preserve">raw_stage.&lt;bảng&gt;</w:t>
+      </w:r>
+      <w:r>
+        <w:rPr>
+          <w:rFonts w:ascii="Arial" w:cs="Arial" w:eastAsia="Arial" w:hAnsi="Arial"/>
+        </w:rPr>
+        <w:t xml:space="preserve">; (2) hàm </w:t>
+      </w:r>
+      <w:r>
+        <w:rPr>
+          <w:rFonts w:ascii="Consolas" w:cs="Consolas" w:eastAsia="Consolas" w:hAnsi="Consolas"/>
+          <w:color w:val="333333"/>
+          <w:sz w:val="21"/>
+          <w:szCs w:val="21"/>
+        </w:rPr>
+        <w:t xml:space="preserve">ctl.promote</w:t>
+      </w:r>
+      <w:r>
+        <w:rPr>
+          <w:rFonts w:ascii="Arial" w:cs="Arial" w:eastAsia="Arial" w:hAnsi="Arial"/>
+        </w:rPr>
+        <w:t xml:space="preserve"> thay bảng </w:t>
+      </w:r>
+      <w:r>
+        <w:rPr>
+          <w:rFonts w:ascii="Consolas" w:cs="Consolas" w:eastAsia="Consolas" w:hAnsi="Consolas"/>
+          <w:color w:val="333333"/>
+          <w:sz w:val="21"/>
+          <w:szCs w:val="21"/>
+        </w:rPr>
+        <w:t xml:space="preserve">raw</w:t>
+      </w:r>
+      <w:r>
+        <w:rPr>
+          <w:rFonts w:ascii="Arial" w:cs="Arial" w:eastAsia="Arial" w:hAnsi="Arial"/>
+        </w:rPr>
+        <w:t xml:space="preserve"> trong </w:t>
+      </w:r>
+      <w:r>
+        <w:rPr>
+          <w:rFonts w:ascii="Arial" w:cs="Arial" w:eastAsia="Arial" w:hAnsi="Arial"/>
+          <w:b/>
+          <w:bCs/>
+        </w:rPr>
+        <w:t xml:space="preserve">một transaction</w:t>
+      </w:r>
+      <w:r>
+        <w:rPr>
+          <w:rFonts w:ascii="Arial" w:cs="Arial" w:eastAsia="Arial" w:hAnsi="Arial"/>
+        </w:rPr>
+        <w:t xml:space="preserve">. PostgreSQL cho phép DDL nằm trong transaction và hoàn tác được </w:t>
       </w:r>
       <w:r>
         <w:rPr>
@@ -4185,212 +4548,13 @@
           <w:sz w:val="21"/>
           <w:szCs w:val="21"/>
         </w:rPr>
-        <w:t xml:space="preserve">[W17]</w:t>
-      </w:r>
-      <w:r>
-        <w:rPr>
-          <w:rFonts w:ascii="Arial" w:cs="Arial" w:eastAsia="Arial" w:hAnsi="Arial"/>
-        </w:rPr>
-        <w:t xml:space="preserve">. Thiết kế, chưa chạy.</w:t>
-      </w:r>
-    </w:p>
-    <w:p>
-      <w:pPr>
-        <w:pStyle w:val="ListParagraph"/>
-        <w:numPr>
-          <w:ilvl w:val="0"/>
-          <w:numId w:val="2"/>
-        </w:numPr>
-        <w:spacing w:after="80" w:line="288"/>
-      </w:pPr>
-      <w:r>
-        <w:rPr>
-          <w:rFonts w:ascii="Arial" w:cs="Arial" w:eastAsia="Arial" w:hAnsi="Arial"/>
-          <w:b/>
-          <w:bCs/>
-        </w:rPr>
-        <w:t xml:space="preserve">Điều phối</w:t>
-      </w:r>
-      <w:r>
-        <w:rPr>
-          <w:rFonts w:ascii="Arial" w:cs="Arial" w:eastAsia="Arial" w:hAnsi="Arial"/>
-        </w:rPr>
-        <w:t xml:space="preserve"> (</w:t>
-      </w:r>
-      <w:r>
-        <w:rPr>
-          <w:rFonts w:ascii="Consolas" w:cs="Consolas" w:eastAsia="Consolas" w:hAnsi="Consolas"/>
-          <w:color w:val="333333"/>
-          <w:sz w:val="21"/>
-          <w:szCs w:val="21"/>
-        </w:rPr>
-        <w:t xml:space="preserve">pl_orchestrator</w:t>
-      </w:r>
-      <w:r>
-        <w:rPr>
-          <w:rFonts w:ascii="Arial" w:cs="Arial" w:eastAsia="Arial" w:hAnsi="Arial"/>
-        </w:rPr>
-        <w:t xml:space="preserve">, Container Apps Job): ADF giới hạn số run đồng thời, run vượt giới hạn xếp hàng </w:t>
-      </w:r>
-      <w:r>
-        <w:rPr>
-          <w:rFonts w:ascii="Arial" w:cs="Arial" w:eastAsia="Arial" w:hAnsi="Arial"/>
-          <w:color w:val="1F5FA8"/>
-          <w:sz w:val="21"/>
-          <w:szCs w:val="21"/>
-        </w:rPr>
-        <w:t xml:space="preserve">[W18]</w:t>
-      </w:r>
-      <w:r>
-        <w:rPr>
-          <w:rFonts w:ascii="Arial" w:cs="Arial" w:eastAsia="Arial" w:hAnsi="Arial"/>
-        </w:rPr>
-        <w:t xml:space="preserve">; Container Apps Job nhận ghi đè cấu hình khi start </w:t>
-      </w:r>
-      <w:r>
-        <w:rPr>
-          <w:rFonts w:ascii="Arial" w:cs="Arial" w:eastAsia="Arial" w:hAnsi="Arial"/>
-          <w:color w:val="1F5FA8"/>
-          <w:sz w:val="21"/>
-          <w:szCs w:val="21"/>
-        </w:rPr>
-        <w:t xml:space="preserve">[W16]</w:t>
-      </w:r>
-      <w:r>
-        <w:rPr>
-          <w:rFonts w:ascii="Arial" w:cs="Arial" w:eastAsia="Arial" w:hAnsi="Arial"/>
-        </w:rPr>
-        <w:t xml:space="preserve">. Thiết kế, chưa chạy.</w:t>
-      </w:r>
-    </w:p>
-    <w:p>
-      <w:pPr>
-        <w:pStyle w:val="ListParagraph"/>
-        <w:numPr>
-          <w:ilvl w:val="0"/>
-          <w:numId w:val="2"/>
-        </w:numPr>
-        <w:spacing w:after="80" w:line="288"/>
-      </w:pPr>
-      <w:r>
-        <w:rPr>
-          <w:rFonts w:ascii="Arial" w:cs="Arial" w:eastAsia="Arial" w:hAnsi="Arial"/>
-          <w:b/>
-          <w:bCs/>
-        </w:rPr>
-        <w:t xml:space="preserve">Key Vault và Terraform</w:t>
-      </w:r>
-      <w:r>
-        <w:rPr>
-          <w:rFonts w:ascii="Arial" w:cs="Arial" w:eastAsia="Arial" w:hAnsi="Arial"/>
-        </w:rPr>
-        <w:t xml:space="preserve">: Container Apps tham chiếu secret trong Key Vault </w:t>
-      </w:r>
-      <w:r>
-        <w:rPr>
-          <w:rFonts w:ascii="Arial" w:cs="Arial" w:eastAsia="Arial" w:hAnsi="Arial"/>
-          <w:color w:val="1F5FA8"/>
-          <w:sz w:val="21"/>
-          <w:szCs w:val="21"/>
-        </w:rPr>
-        <w:t xml:space="preserve">[W23]</w:t>
-      </w:r>
-      <w:r>
-        <w:rPr>
-          <w:rFonts w:ascii="Arial" w:cs="Arial" w:eastAsia="Arial" w:hAnsi="Arial"/>
-        </w:rPr>
-        <w:t xml:space="preserve">; Terraform dựng hạ tầng. Thiết kế, chưa triển khai.</w:t>
-      </w:r>
-    </w:p>
-    <w:p>
-      <w:pPr>
-        <w:pStyle w:val="ListParagraph"/>
-        <w:numPr>
-          <w:ilvl w:val="0"/>
-          <w:numId w:val="2"/>
-        </w:numPr>
-        <w:spacing w:after="80" w:line="288"/>
-      </w:pPr>
-      <w:r>
-        <w:rPr>
-          <w:rFonts w:ascii="Arial" w:cs="Arial" w:eastAsia="Arial" w:hAnsi="Arial"/>
-          <w:b/>
-          <w:bCs/>
-        </w:rPr>
-        <w:t xml:space="preserve">Docker Compose</w:t>
-      </w:r>
-      <w:r>
-        <w:rPr>
-          <w:rFonts w:ascii="Arial" w:cs="Arial" w:eastAsia="Arial" w:hAnsi="Arial"/>
-        </w:rPr>
-        <w:t xml:space="preserve"> (</w:t>
-      </w:r>
-      <w:r>
-        <w:rPr>
-          <w:rFonts w:ascii="Consolas" w:cs="Consolas" w:eastAsia="Consolas" w:hAnsi="Consolas"/>
-          <w:color w:val="333333"/>
-          <w:sz w:val="21"/>
-          <w:szCs w:val="21"/>
-        </w:rPr>
-        <w:t xml:space="preserve">scripts/run_local.sh</w:t>
-      </w:r>
-      <w:r>
-        <w:rPr>
-          <w:rFonts w:ascii="Arial" w:cs="Arial" w:eastAsia="Arial" w:hAnsi="Arial"/>
-        </w:rPr>
-        <w:t xml:space="preserve">): dựng kho rỗng, nạp dữ liệu mẫu, chạy dbt và Elementary bằng một lệnh. Đã có local </w:t>
-      </w:r>
-      <w:r>
-        <w:rPr>
-          <w:rFonts w:ascii="Arial" w:cs="Arial" w:eastAsia="Arial" w:hAnsi="Arial"/>
-          <w:color w:val="1F5FA8"/>
-          <w:sz w:val="21"/>
-          <w:szCs w:val="21"/>
-        </w:rPr>
-        <w:t xml:space="preserve">[L]</w:t>
-      </w:r>
-      <w:r>
-        <w:rPr>
-          <w:rFonts w:ascii="Arial" w:cs="Arial" w:eastAsia="Arial" w:hAnsi="Arial"/>
-        </w:rPr>
-        <w:t xml:space="preserve">.</w:t>
-      </w:r>
-    </w:p>
-    <w:p>
-      <w:pPr>
-        <w:pStyle w:val="Heading2"/>
-      </w:pPr>
-      <w:r>
-        <w:rPr>
-          <w:rFonts w:ascii="Arial" w:cs="Arial" w:eastAsia="Arial" w:hAnsi="Arial"/>
-        </w:rPr>
-        <w:t xml:space="preserve">2.3. Luồng nạp: bảng đệm rồi thay bảng trong một transaction</w:t>
-      </w:r>
-    </w:p>
-    <w:p>
-      <w:pPr>
-        <w:spacing w:after="140" w:line="300"/>
-      </w:pPr>
-      <w:r>
-        <w:rPr>
-          <w:rFonts w:ascii="Arial" w:cs="Arial" w:eastAsia="Arial" w:hAnsi="Arial"/>
-        </w:rPr>
-        <w:t xml:space="preserve">Mỗi bảng nạp qua hai bước: (1) sao chép nguyên bản vào bảng đệm </w:t>
-      </w:r>
-      <w:r>
-        <w:rPr>
-          <w:rFonts w:ascii="Consolas" w:cs="Consolas" w:eastAsia="Consolas" w:hAnsi="Consolas"/>
-          <w:color w:val="333333"/>
-          <w:sz w:val="21"/>
-          <w:szCs w:val="21"/>
-        </w:rPr>
-        <w:t xml:space="preserve">raw_stage.&lt;bảng&gt;</w:t>
-      </w:r>
-      <w:r>
-        <w:rPr>
-          <w:rFonts w:ascii="Arial" w:cs="Arial" w:eastAsia="Arial" w:hAnsi="Arial"/>
-        </w:rPr>
-        <w:t xml:space="preserve">; (2) hàm </w:t>
+        <w:t xml:space="preserve">[W15]</w:t>
+      </w:r>
+      <w:r>
+        <w:rPr>
+          <w:rFonts w:ascii="Arial" w:cs="Arial" w:eastAsia="Arial" w:hAnsi="Arial"/>
+        </w:rPr>
+        <w:t xml:space="preserve">, nên bảng đích không bao giờ ở trạng thái nửa vời; bước (1) lỗi thì bước (2) không chạy và raw cũ giữ nguyên. Hàm </w:t>
       </w:r>
       <w:r>
         <w:rPr>
@@ -4405,51 +4569,22 @@
         <w:rPr>
           <w:rFonts w:ascii="Arial" w:cs="Arial" w:eastAsia="Arial" w:hAnsi="Arial"/>
         </w:rPr>
-        <w:t xml:space="preserve"> thay bảng </w:t>
-      </w:r>
-      <w:r>
-        <w:rPr>
-          <w:rFonts w:ascii="Consolas" w:cs="Consolas" w:eastAsia="Consolas" w:hAnsi="Consolas"/>
-          <w:color w:val="333333"/>
-          <w:sz w:val="21"/>
-          <w:szCs w:val="21"/>
-        </w:rPr>
-        <w:t xml:space="preserve">raw</w:t>
-      </w:r>
-      <w:r>
-        <w:rPr>
-          <w:rFonts w:ascii="Arial" w:cs="Arial" w:eastAsia="Arial" w:hAnsi="Arial"/>
-        </w:rPr>
-        <w:t xml:space="preserve"> trong </w:t>
-      </w:r>
-      <w:r>
-        <w:rPr>
-          <w:rFonts w:ascii="Arial" w:cs="Arial" w:eastAsia="Arial" w:hAnsi="Arial"/>
-          <w:b/>
-          <w:bCs/>
-        </w:rPr>
-        <w:t xml:space="preserve">một transaction</w:t>
-      </w:r>
-      <w:r>
-        <w:rPr>
-          <w:rFonts w:ascii="Arial" w:cs="Arial" w:eastAsia="Arial" w:hAnsi="Arial"/>
-        </w:rPr>
-        <w:t xml:space="preserve">. PostgreSQL cho phép DDL nằm trong transaction và hoàn tác được </w:t>
-      </w:r>
-      <w:r>
-        <w:rPr>
-          <w:rFonts w:ascii="Arial" w:cs="Arial" w:eastAsia="Arial" w:hAnsi="Arial"/>
-          <w:color w:val="1F5FA8"/>
-          <w:sz w:val="21"/>
-          <w:szCs w:val="21"/>
-        </w:rPr>
-        <w:t xml:space="preserve">[W15]</w:t>
-      </w:r>
-      <w:r>
-        <w:rPr>
-          <w:rFonts w:ascii="Arial" w:cs="Arial" w:eastAsia="Arial" w:hAnsi="Arial"/>
-        </w:rPr>
-        <w:t xml:space="preserve">, nên bảng đích không bao giờ ở trạng thái nửa vời; bước (1) lỗi thì bước (2) không chạy và raw cũ giữ nguyên. Ba kiểu nạp:</w:t>
+        <w:t xml:space="preserve"> và các bảng ghi log nằm trong schema </w:t>
+      </w:r>
+      <w:r>
+        <w:rPr>
+          <w:rFonts w:ascii="Consolas" w:cs="Consolas" w:eastAsia="Consolas" w:hAnsi="Consolas"/>
+          <w:color w:val="333333"/>
+          <w:sz w:val="21"/>
+          <w:szCs w:val="21"/>
+        </w:rPr>
+        <w:t xml:space="preserve">ctl</w:t>
+      </w:r>
+      <w:r>
+        <w:rPr>
+          <w:rFonts w:ascii="Arial" w:cs="Arial" w:eastAsia="Arial" w:hAnsi="Arial"/>
+        </w:rPr>
+        <w:t xml:space="preserve"> (viết tắt của control, schema điều khiển việc nạp và điều phối); phần này là thiết kế, chưa có trong bản local. Ba kiểu nạp:</w:t>
       </w:r>
     </w:p>
     <w:p>

</xml_diff>